<commit_message>
Add designed covers and use the real Guild logo
The title page used a typed wordmark with the dots in a row, which does
not match the logo. Cut the wordmark from the club's own artwork, with
the three dots stacked beside the d, and use it on the title page and
covers.

Add a full-colour front cover and a back cover with a blurb, key
features and audience line, following academic coursebook practice.
Number the front matter in roman numerals, restart at 1 for Part 1, and
add a running head with the book title and the current part.

Co-Authored-By: Claude Opus 5.5 <noreply@anthropic.com>
Claude-Session: https://claude.ai/code/session_01VkNWz9zCVkDAANuF8jpQYy
</commit_message>
<xml_diff>
--- a/Translation-Handbook.docx
+++ b/Translation-Handbook.docx
@@ -3,80 +3,111 @@
 <w:document xmlns:wpc="http://schemas.microsoft.com/office/word/2010/wordprocessingCanvas" xmlns:mc="http://schemas.openxmlformats.org/markup-compatibility/2006" xmlns:o="urn:schemas-microsoft-com:office:office" xmlns:r="http://schemas.openxmlformats.org/officeDocument/2006/relationships" xmlns:m="http://schemas.openxmlformats.org/officeDocument/2006/math" xmlns:v="urn:schemas-microsoft-com:vml" xmlns:wp14="http://schemas.microsoft.com/office/word/2010/wordprocessingDrawing" xmlns:wp="http://schemas.openxmlformats.org/drawingml/2006/wordprocessingDrawing" xmlns:w10="urn:schemas-microsoft-com:office:word" xmlns:w="http://schemas.openxmlformats.org/wordprocessingml/2006/main" xmlns:w14="http://schemas.microsoft.com/office/word/2010/wordml" xmlns:w15="http://schemas.microsoft.com/office/word/2012/wordml" xmlns:wpg="http://schemas.microsoft.com/office/word/2010/wordprocessingGroup" xmlns:wpi="http://schemas.microsoft.com/office/word/2010/wordprocessingInk" xmlns:wne="http://schemas.microsoft.com/office/word/2006/wordml" xmlns:wps="http://schemas.microsoft.com/office/word/2010/wordprocessingShape" xmlns:cx="http://schemas.microsoft.com/office/drawing/2014/chartex" xmlns:cx1="http://schemas.microsoft.com/office/drawing/2015/9/8/chartex" xmlns:cx2="http://schemas.microsoft.com/office/drawing/2015/10/21/chartex" xmlns:cx3="http://schemas.microsoft.com/office/drawing/2016/5/9/chartex" xmlns:cx4="http://schemas.microsoft.com/office/drawing/2016/5/10/chartex" xmlns:cx5="http://schemas.microsoft.com/office/drawing/2016/5/11/chartex" xmlns:cx6="http://schemas.microsoft.com/office/drawing/2016/5/12/chartex" xmlns:cx7="http://schemas.microsoft.com/office/drawing/2016/5/13/chartex" xmlns:cx8="http://schemas.microsoft.com/office/drawing/2016/5/14/chartex" xmlns:aink="http://schemas.microsoft.com/office/drawing/2016/ink" xmlns:am3d="http://schemas.microsoft.com/office/drawing/2017/model3d" xmlns:w16cex="http://schemas.microsoft.com/office/word/2018/wordml/cex" xmlns:w16cid="http://schemas.microsoft.com/office/word/2016/wordml/cid" xmlns:w16="http://schemas.microsoft.com/office/word/2018/wordml" xmlns:w16sdtdh="http://schemas.microsoft.com/office/word/2020/wordml/sdtdatahash" xmlns:w16se="http://schemas.microsoft.com/office/word/2015/wordml/symex" mc:Ignorable="w14 w15 wp14">
   <w:body>
     <w:p>
+      <w:r>
+        <w:drawing>
+          <wp:anchor distT="0" distB="0" distL="0" distR="0" simplePos="0" allowOverlap="1" behindDoc="1" locked="0" layoutInCell="1" relativeHeight="9001125">
+            <wp:simplePos x="0" y="0"/>
+            <wp:positionH relativeFrom="page">
+              <wp:posOffset>0</wp:posOffset>
+            </wp:positionH>
+            <wp:positionV relativeFrom="page">
+              <wp:posOffset>0</wp:posOffset>
+            </wp:positionV>
+            <wp:extent cx="6334125" cy="9001125"/>
+            <wp:effectExtent t="0" r="0" b="0" l="0"/>
+            <wp:wrapNone/>
+            <wp:docPr id="1" name="" descr="" title=""/>
+            <wp:cNvGraphicFramePr>
+              <a:graphicFrameLocks xmlns:a="http://schemas.openxmlformats.org/drawingml/2006/main" noChangeAspect="1"/>
+            </wp:cNvGraphicFramePr>
+            <a:graphic xmlns:a="http://schemas.openxmlformats.org/drawingml/2006/main">
+              <a:graphicData uri="http://schemas.openxmlformats.org/drawingml/2006/picture">
+                <pic:pic xmlns:pic="http://schemas.openxmlformats.org/drawingml/2006/picture">
+                  <pic:nvPicPr>
+                    <pic:cNvPr id="0" name="" descr=""/>
+                    <pic:cNvPicPr>
+                      <a:picLocks noChangeAspect="1" noChangeArrowheads="1"/>
+                    </pic:cNvPicPr>
+                  </pic:nvPicPr>
+                  <pic:blipFill>
+                    <a:blip r:embed="rId15" cstate="none"/>
+                    <a:srcRect/>
+                    <a:stretch>
+                      <a:fillRect/>
+                    </a:stretch>
+                  </pic:blipFill>
+                  <pic:spPr bwMode="auto">
+                    <a:xfrm>
+                      <a:off x="0" y="0"/>
+                      <a:ext cx="6334125" cy="9001125"/>
+                    </a:xfrm>
+                    <a:prstGeom prst="rect">
+                      <a:avLst/>
+                    </a:prstGeom>
+                  </pic:spPr>
+                </pic:pic>
+              </a:graphicData>
+            </a:graphic>
+          </wp:anchor>
+        </w:drawing>
+      </w:r>
+    </w:p>
+    <w:p>
+      <w:pPr>
+        <w:sectPr>
+          <w:headerReference w:type="default" r:id="rId7"/>
+          <w:footerReference w:type="default" r:id="rId8"/>
+          <w:pgSz w:w="9979" w:h="14175" w:orient="portrait"/>
+          <w:pgMar w:top="0" w:right="0" w:bottom="0" w:left="0" w:header="0" w:footer="0" w:gutter="0"/>
+          <w:pgNumType/>
+          <w:docGrid w:linePitch="360"/>
+        </w:sectPr>
+      </w:pPr>
+    </w:p>
+    <w:p>
       <w:pPr>
         <w:spacing w:after="0" w:before="900"/>
         <w:jc w:val="center"/>
       </w:pPr>
       <w:r>
-        <w:rPr>
-          <w:rFonts w:ascii="Georgia" w:cs="Georgia" w:eastAsia="Georgia" w:hAnsi="Georgia"/>
-          <w:b/>
-          <w:bCs/>
-          <w:color w:val="3D1591"/>
-          <w:sz w:val="72"/>
-          <w:szCs w:val="72"/>
-        </w:rPr>
-        <w:t xml:space="preserve">Guild </w:t>
-      </w:r>
-      <w:r>
-        <w:rPr>
-          <w:rFonts w:ascii="Arial" w:cs="Arial" w:eastAsia="Arial" w:hAnsi="Arial"/>
-          <w:color w:val="8756C0"/>
-          <w:sz w:val="42"/>
-          <w:szCs w:val="42"/>
-        </w:rPr>
-        <w:t xml:space="preserve">●</w:t>
-      </w:r>
-      <w:r>
-        <w:rPr>
-          <w:rFonts w:ascii="Arial" w:cs="Arial" w:eastAsia="Arial" w:hAnsi="Arial"/>
-          <w:color w:val="867EF6"/>
-          <w:sz w:val="42"/>
-          <w:szCs w:val="42"/>
-        </w:rPr>
-        <w:t xml:space="preserve">●</w:t>
-      </w:r>
-      <w:r>
-        <w:rPr>
-          <w:rFonts w:ascii="Arial" w:cs="Arial" w:eastAsia="Arial" w:hAnsi="Arial"/>
-          <w:color w:val="CCCDFB"/>
-          <w:sz w:val="42"/>
-          <w:szCs w:val="42"/>
-        </w:rPr>
-        <w:t xml:space="preserve">●</w:t>
-      </w:r>
-    </w:p>
-    <w:p>
-      <w:pPr>
-        <w:spacing w:after="40"/>
-        <w:jc w:val="center"/>
-      </w:pPr>
-      <w:r>
-        <w:rPr>
-          <w:rFonts w:ascii="Georgia" w:cs="Georgia" w:eastAsia="Georgia" w:hAnsi="Georgia"/>
-          <w:b/>
-          <w:bCs/>
-          <w:color w:val="3D1591"/>
-          <w:sz w:val="28"/>
-          <w:szCs w:val="28"/>
-        </w:rPr>
-        <w:t xml:space="preserve">Translation Team</w:t>
-      </w:r>
-    </w:p>
-    <w:p>
-      <w:pPr>
-        <w:spacing w:after="0"/>
-        <w:jc w:val="center"/>
-      </w:pPr>
-      <w:r>
-        <w:rPr>
-          <w:rFonts w:ascii="Calibri" w:cs="Calibri" w:eastAsia="Calibri" w:hAnsi="Calibri"/>
-          <w:color w:val="6B6680"/>
-          <w:spacing w:val="60"/>
-          <w:sz w:val="16"/>
-          <w:szCs w:val="16"/>
-        </w:rPr>
-        <w:t xml:space="preserve">Professional Club</w:t>
+        <w:drawing>
+          <wp:inline distT="0" distB="0" distL="0" distR="0">
+            <wp:extent cx="2171700" cy="1066800"/>
+            <wp:effectExtent t="0" r="0" b="0" l="0"/>
+            <wp:docPr id="1" name="" descr="" title=""/>
+            <wp:cNvGraphicFramePr>
+              <a:graphicFrameLocks xmlns:a="http://schemas.openxmlformats.org/drawingml/2006/main" noChangeAspect="1"/>
+            </wp:cNvGraphicFramePr>
+            <a:graphic xmlns:a="http://schemas.openxmlformats.org/drawingml/2006/main">
+              <a:graphicData uri="http://schemas.openxmlformats.org/drawingml/2006/picture">
+                <pic:pic xmlns:pic="http://schemas.openxmlformats.org/drawingml/2006/picture">
+                  <pic:nvPicPr>
+                    <pic:cNvPr id="0" name="" descr=""/>
+                    <pic:cNvPicPr>
+                      <a:picLocks noChangeAspect="1" noChangeArrowheads="1"/>
+                    </pic:cNvPicPr>
+                  </pic:nvPicPr>
+                  <pic:blipFill>
+                    <a:blip r:embed="rId16" cstate="none"/>
+                    <a:srcRect/>
+                    <a:stretch>
+                      <a:fillRect/>
+                    </a:stretch>
+                  </pic:blipFill>
+                  <pic:spPr bwMode="auto">
+                    <a:xfrm>
+                      <a:off x="0" y="0"/>
+                      <a:ext cx="2171700" cy="1066800"/>
+                    </a:xfrm>
+                    <a:prstGeom prst="rect">
+                      <a:avLst/>
+                    </a:prstGeom>
+                  </pic:spPr>
+                </pic:pic>
+              </a:graphicData>
+            </a:graphic>
+          </wp:inline>
+        </w:drawing>
       </w:r>
     </w:p>
     <w:p>
@@ -1442,8 +1473,19 @@
     </w:p>
     <w:p>
       <w:pPr>
+        <w:sectPr>
+          <w:headerReference w:type="default" r:id="rId9"/>
+          <w:footerReference w:type="default" r:id="rId10"/>
+          <w:pgSz w:w="9979" w:h="14175" w:orient="portrait"/>
+          <w:pgMar w:top="1134" w:right="1134" w:bottom="1134" w:left="1134" w:header="567" w:footer="510" w:gutter="0"/>
+          <w:pgNumType w:start="1" w:fmt="lowerRoman"/>
+          <w:docGrid w:linePitch="360"/>
+        </w:sectPr>
+      </w:pPr>
+    </w:p>
+    <w:p>
+      <w:pPr>
         <w:pStyle w:val="Heading1"/>
-        <w:pageBreakBefore/>
       </w:pPr>
       <w:r>
         <w:t xml:space="preserve">Part 1: Getting started</w:t>
@@ -38240,135 +38282,71 @@
     </w:p>
     <w:p>
       <w:pPr>
-        <w:pageBreakBefore/>
-        <w:spacing w:after="200" w:before="2400"/>
-        <w:jc w:val="center"/>
-      </w:pPr>
-      <w:r>
-        <w:rPr>
-          <w:rFonts w:ascii="Georgia" w:cs="Georgia" w:eastAsia="Georgia" w:hAnsi="Georgia"/>
-          <w:i/>
-          <w:iCs/>
-          <w:color w:val="1F1A2E"/>
-          <w:sz w:val="30"/>
-          <w:szCs w:val="30"/>
-        </w:rPr>
-        <w:t xml:space="preserve">“Translate the meaning, not the words.”</w:t>
-      </w:r>
-    </w:p>
-    <w:p>
-      <w:pPr>
-        <w:bidi/>
-        <w:spacing w:after="600"/>
-        <w:jc w:val="center"/>
-      </w:pPr>
-      <w:r>
-        <w:rPr>
-          <w:rFonts w:ascii="Arial" w:cs="Arial" w:hAnsi="Arial"/>
-          <w:color w:val="6B6680"/>
-          <w:sz w:val="28"/>
-          <w:szCs w:val="28"/>
-          <w:rtl/>
-        </w:rPr>
-        <w:t xml:space="preserve">ترجِمِ المعنى، لا الكلمات.</w:t>
-      </w:r>
-    </w:p>
-    <w:p>
-      <w:pPr>
-        <w:spacing w:after="1600" w:line="300"/>
-        <w:jc w:val="center"/>
-      </w:pPr>
-      <w:r>
-        <w:rPr>
-          <w:rFonts w:ascii="Calibri" w:cs="Calibri" w:eastAsia="Calibri" w:hAnsi="Calibri"/>
-          <w:color w:val="6B6680"/>
-          <w:sz w:val="20"/>
-          <w:szCs w:val="20"/>
-        </w:rPr>
-        <w:t xml:space="preserve">A step-by-step guide for beginners who want to translate between English and Arabic: from preparing a text to checking and explaining the result, with examples in both languages, exercises and answers.</w:t>
-      </w:r>
-    </w:p>
-    <w:p>
-      <w:pPr>
-        <w:spacing w:after="0" w:before="0"/>
-        <w:jc w:val="center"/>
-      </w:pPr>
-      <w:r>
-        <w:rPr>
-          <w:rFonts w:ascii="Georgia" w:cs="Georgia" w:eastAsia="Georgia" w:hAnsi="Georgia"/>
-          <w:b/>
-          <w:bCs/>
-          <w:color w:val="3D1591"/>
-          <w:sz w:val="48"/>
-          <w:szCs w:val="48"/>
-        </w:rPr>
-        <w:t xml:space="preserve">Guild </w:t>
-      </w:r>
-      <w:r>
-        <w:rPr>
-          <w:rFonts w:ascii="Arial" w:cs="Arial" w:eastAsia="Arial" w:hAnsi="Arial"/>
-          <w:color w:val="8756C0"/>
-          <w:sz w:val="28"/>
-          <w:szCs w:val="28"/>
-        </w:rPr>
-        <w:t xml:space="preserve">●</w:t>
-      </w:r>
-      <w:r>
-        <w:rPr>
-          <w:rFonts w:ascii="Arial" w:cs="Arial" w:eastAsia="Arial" w:hAnsi="Arial"/>
-          <w:color w:val="867EF6"/>
-          <w:sz w:val="28"/>
-          <w:szCs w:val="28"/>
-        </w:rPr>
-        <w:t xml:space="preserve">●</w:t>
-      </w:r>
-      <w:r>
-        <w:rPr>
-          <w:rFonts w:ascii="Arial" w:cs="Arial" w:eastAsia="Arial" w:hAnsi="Arial"/>
-          <w:color w:val="CCCDFB"/>
-          <w:sz w:val="28"/>
-          <w:szCs w:val="28"/>
-        </w:rPr>
-        <w:t xml:space="preserve">●</w:t>
-      </w:r>
-    </w:p>
-    <w:p>
-      <w:pPr>
-        <w:spacing w:after="40"/>
-        <w:jc w:val="center"/>
-      </w:pPr>
-      <w:r>
-        <w:rPr>
-          <w:rFonts w:ascii="Georgia" w:cs="Georgia" w:eastAsia="Georgia" w:hAnsi="Georgia"/>
-          <w:b/>
-          <w:bCs/>
-          <w:color w:val="3D1591"/>
-          <w:sz w:val="18"/>
-          <w:szCs w:val="18"/>
-        </w:rPr>
-        <w:t xml:space="preserve">Translation Team</w:t>
-      </w:r>
-    </w:p>
-    <w:p>
-      <w:pPr>
-        <w:spacing w:after="0"/>
-        <w:jc w:val="center"/>
-      </w:pPr>
-      <w:r>
-        <w:rPr>
-          <w:rFonts w:ascii="Calibri" w:cs="Calibri" w:eastAsia="Calibri" w:hAnsi="Calibri"/>
-          <w:color w:val="6B6680"/>
-          <w:spacing w:val="60"/>
-          <w:sz w:val="10"/>
-          <w:szCs w:val="10"/>
-        </w:rPr>
-        <w:t xml:space="preserve">Professional Club</w:t>
+        <w:sectPr>
+          <w:headerReference w:type="default" r:id="rId11"/>
+          <w:footerReference w:type="default" r:id="rId12"/>
+          <w:pgSz w:w="9979" w:h="14175" w:orient="portrait"/>
+          <w:pgMar w:top="1134" w:right="1134" w:bottom="1134" w:left="1134" w:header="567" w:footer="510" w:gutter="0"/>
+          <w:pgNumType w:start="1" w:fmt="decimal"/>
+          <w:docGrid w:linePitch="360"/>
+        </w:sectPr>
+      </w:pPr>
+    </w:p>
+    <w:p>
+      <w:r>
+        <w:drawing>
+          <wp:anchor distT="0" distB="0" distL="0" distR="0" simplePos="0" allowOverlap="1" behindDoc="1" locked="0" layoutInCell="1" relativeHeight="9001125">
+            <wp:simplePos x="0" y="0"/>
+            <wp:positionH relativeFrom="page">
+              <wp:posOffset>0</wp:posOffset>
+            </wp:positionH>
+            <wp:positionV relativeFrom="page">
+              <wp:posOffset>0</wp:posOffset>
+            </wp:positionV>
+            <wp:extent cx="6334125" cy="9001125"/>
+            <wp:effectExtent t="0" r="0" b="0" l="0"/>
+            <wp:wrapNone/>
+            <wp:docPr id="1" name="" descr="" title=""/>
+            <wp:cNvGraphicFramePr>
+              <a:graphicFrameLocks xmlns:a="http://schemas.openxmlformats.org/drawingml/2006/main" noChangeAspect="1"/>
+            </wp:cNvGraphicFramePr>
+            <a:graphic xmlns:a="http://schemas.openxmlformats.org/drawingml/2006/main">
+              <a:graphicData uri="http://schemas.openxmlformats.org/drawingml/2006/picture">
+                <pic:pic xmlns:pic="http://schemas.openxmlformats.org/drawingml/2006/picture">
+                  <pic:nvPicPr>
+                    <pic:cNvPr id="0" name="" descr=""/>
+                    <pic:cNvPicPr>
+                      <a:picLocks noChangeAspect="1" noChangeArrowheads="1"/>
+                    </pic:cNvPicPr>
+                  </pic:nvPicPr>
+                  <pic:blipFill>
+                    <a:blip r:embed="rId17" cstate="none"/>
+                    <a:srcRect/>
+                    <a:stretch>
+                      <a:fillRect/>
+                    </a:stretch>
+                  </pic:blipFill>
+                  <pic:spPr bwMode="auto">
+                    <a:xfrm>
+                      <a:off x="0" y="0"/>
+                      <a:ext cx="6334125" cy="9001125"/>
+                    </a:xfrm>
+                    <a:prstGeom prst="rect">
+                      <a:avLst/>
+                    </a:prstGeom>
+                  </pic:spPr>
+                </pic:pic>
+              </a:graphicData>
+            </a:graphic>
+          </wp:anchor>
+        </w:drawing>
       </w:r>
     </w:p>
     <w:sectPr>
-      <w:footerReference w:type="default" r:id="rId7"/>
+      <w:headerReference w:type="default" r:id="rId13"/>
+      <w:footerReference w:type="default" r:id="rId14"/>
       <w:pgSz w:w="9979" w:h="14175" w:orient="portrait"/>
-      <w:pgMar w:top="1134" w:right="1134" w:bottom="1134" w:left="1134" w:header="708" w:footer="510" w:gutter="0"/>
+      <w:pgMar w:top="0" w:right="0" w:bottom="0" w:left="0" w:header="0" w:footer="0" w:gutter="0"/>
       <w:pgNumType/>
       <w:docGrid w:linePitch="360"/>
     </w:sectPr>
@@ -38418,6 +38396,12 @@
 </file>
 
 <file path=word/footer1.xml><?xml version="1.0" encoding="utf-8"?>
+<w:ftr xmlns:wpc="http://schemas.microsoft.com/office/word/2010/wordprocessingCanvas" xmlns:mc="http://schemas.openxmlformats.org/markup-compatibility/2006" xmlns:o="urn:schemas-microsoft-com:office:office" xmlns:r="http://schemas.openxmlformats.org/officeDocument/2006/relationships" xmlns:m="http://schemas.openxmlformats.org/officeDocument/2006/math" xmlns:v="urn:schemas-microsoft-com:vml" xmlns:wp14="http://schemas.microsoft.com/office/word/2010/wordprocessingDrawing" xmlns:wp="http://schemas.openxmlformats.org/drawingml/2006/wordprocessingDrawing" xmlns:w10="urn:schemas-microsoft-com:office:word" xmlns:w="http://schemas.openxmlformats.org/wordprocessingml/2006/main" xmlns:w14="http://schemas.microsoft.com/office/word/2010/wordml" xmlns:w15="http://schemas.microsoft.com/office/word/2012/wordml" xmlns:wpg="http://schemas.microsoft.com/office/word/2010/wordprocessingGroup" xmlns:wpi="http://schemas.microsoft.com/office/word/2010/wordprocessingInk" xmlns:wne="http://schemas.microsoft.com/office/word/2006/wordml" xmlns:wps="http://schemas.microsoft.com/office/word/2010/wordprocessingShape">
+  <w:p/>
+</w:ftr>
+</file>
+
+<file path=word/footer2.xml><?xml version="1.0" encoding="utf-8"?>
 <w:ftr xmlns:wpc="http://schemas.microsoft.com/office/word/2010/wordprocessingCanvas" xmlns:mc="http://schemas.openxmlformats.org/markup-compatibility/2006" xmlns:o="urn:schemas-microsoft-com:office:office" xmlns:r="http://schemas.openxmlformats.org/officeDocument/2006/relationships" xmlns:m="http://schemas.openxmlformats.org/officeDocument/2006/math" xmlns:v="urn:schemas-microsoft-com:vml" xmlns:wp14="http://schemas.microsoft.com/office/word/2010/wordprocessingDrawing" xmlns:wp="http://schemas.openxmlformats.org/drawingml/2006/wordprocessingDrawing" xmlns:w10="urn:schemas-microsoft-com:office:word" xmlns:w="http://schemas.openxmlformats.org/wordprocessingml/2006/main" xmlns:w14="http://schemas.microsoft.com/office/word/2010/wordml" xmlns:w15="http://schemas.microsoft.com/office/word/2012/wordml" xmlns:wpg="http://schemas.microsoft.com/office/word/2010/wordprocessingGroup" xmlns:wpi="http://schemas.microsoft.com/office/word/2010/wordprocessingInk" xmlns:wne="http://schemas.microsoft.com/office/word/2006/wordml" xmlns:wps="http://schemas.microsoft.com/office/word/2010/wordprocessingShape">
   <w:p>
     <w:pPr>
@@ -38439,6 +38423,34 @@
 </w:ftr>
 </file>
 
+<file path=word/footer3.xml><?xml version="1.0" encoding="utf-8"?>
+<w:ftr xmlns:wpc="http://schemas.microsoft.com/office/word/2010/wordprocessingCanvas" xmlns:mc="http://schemas.openxmlformats.org/markup-compatibility/2006" xmlns:o="urn:schemas-microsoft-com:office:office" xmlns:r="http://schemas.openxmlformats.org/officeDocument/2006/relationships" xmlns:m="http://schemas.openxmlformats.org/officeDocument/2006/math" xmlns:v="urn:schemas-microsoft-com:vml" xmlns:wp14="http://schemas.microsoft.com/office/word/2010/wordprocessingDrawing" xmlns:wp="http://schemas.openxmlformats.org/drawingml/2006/wordprocessingDrawing" xmlns:w10="urn:schemas-microsoft-com:office:word" xmlns:w="http://schemas.openxmlformats.org/wordprocessingml/2006/main" xmlns:w14="http://schemas.microsoft.com/office/word/2010/wordml" xmlns:w15="http://schemas.microsoft.com/office/word/2012/wordml" xmlns:wpg="http://schemas.microsoft.com/office/word/2010/wordprocessingGroup" xmlns:wpi="http://schemas.microsoft.com/office/word/2010/wordprocessingInk" xmlns:wne="http://schemas.microsoft.com/office/word/2006/wordml" xmlns:wps="http://schemas.microsoft.com/office/word/2010/wordprocessingShape">
+  <w:p>
+    <w:pPr>
+      <w:jc w:val="center"/>
+    </w:pPr>
+    <w:r>
+      <w:rPr>
+        <w:rFonts w:ascii="Calibri" w:cs="Calibri" w:eastAsia="Calibri" w:hAnsi="Calibri"/>
+        <w:color w:val="6B6680"/>
+        <w:sz w:val="17"/>
+        <w:szCs w:val="17"/>
+      </w:rPr>
+      <w:fldChar w:fldCharType="begin"/>
+      <w:instrText xml:space="preserve">PAGE</w:instrText>
+      <w:fldChar w:fldCharType="separate"/>
+      <w:fldChar w:fldCharType="end"/>
+    </w:r>
+  </w:p>
+</w:ftr>
+</file>
+
+<file path=word/footer4.xml><?xml version="1.0" encoding="utf-8"?>
+<w:ftr xmlns:wpc="http://schemas.microsoft.com/office/word/2010/wordprocessingCanvas" xmlns:mc="http://schemas.openxmlformats.org/markup-compatibility/2006" xmlns:o="urn:schemas-microsoft-com:office:office" xmlns:r="http://schemas.openxmlformats.org/officeDocument/2006/relationships" xmlns:m="http://schemas.openxmlformats.org/officeDocument/2006/math" xmlns:v="urn:schemas-microsoft-com:vml" xmlns:wp14="http://schemas.microsoft.com/office/word/2010/wordprocessingDrawing" xmlns:wp="http://schemas.openxmlformats.org/drawingml/2006/wordprocessingDrawing" xmlns:w10="urn:schemas-microsoft-com:office:word" xmlns:w="http://schemas.openxmlformats.org/wordprocessingml/2006/main" xmlns:w14="http://schemas.microsoft.com/office/word/2010/wordml" xmlns:w15="http://schemas.microsoft.com/office/word/2012/wordml" xmlns:wpg="http://schemas.microsoft.com/office/word/2010/wordprocessingGroup" xmlns:wpi="http://schemas.microsoft.com/office/word/2010/wordprocessingInk" xmlns:wne="http://schemas.microsoft.com/office/word/2006/wordml" xmlns:wps="http://schemas.microsoft.com/office/word/2010/wordprocessingShape">
+  <w:p/>
+</w:ftr>
+</file>
+
 <file path=word/footnotes.xml><?xml version="1.0" encoding="utf-8"?>
 <w:footnotes xmlns:wpc="http://schemas.microsoft.com/office/word/2010/wordprocessingCanvas" xmlns:mc="http://schemas.openxmlformats.org/markup-compatibility/2006" xmlns:o="urn:schemas-microsoft-com:office:office" xmlns:r="http://schemas.openxmlformats.org/officeDocument/2006/relationships" xmlns:m="http://schemas.openxmlformats.org/officeDocument/2006/math" xmlns:v="urn:schemas-microsoft-com:vml" xmlns:wp14="http://schemas.microsoft.com/office/word/2010/wordprocessingDrawing" xmlns:wp="http://schemas.openxmlformats.org/drawingml/2006/wordprocessingDrawing" xmlns:w10="urn:schemas-microsoft-com:office:word" xmlns:w="http://schemas.openxmlformats.org/wordprocessingml/2006/main" xmlns:w14="http://schemas.microsoft.com/office/word/2010/wordml" xmlns:w15="http://schemas.microsoft.com/office/word/2012/wordml" xmlns:wpg="http://schemas.microsoft.com/office/word/2010/wordprocessingGroup" xmlns:wpi="http://schemas.microsoft.com/office/word/2010/wordprocessingInk" xmlns:wne="http://schemas.microsoft.com/office/word/2006/wordml" xmlns:wps="http://schemas.microsoft.com/office/word/2010/wordprocessingShape" mc:Ignorable="w14 w15 wp14">
   <w:footnote w:type="separator" w:id="-1">
@@ -38474,6 +38486,59 @@
     </w:p>
   </w:footnote>
 </w:footnotes>
+</file>
+
+<file path=word/header1.xml><?xml version="1.0" encoding="utf-8"?>
+<w:hdr xmlns:wpc="http://schemas.microsoft.com/office/word/2010/wordprocessingCanvas" xmlns:mc="http://schemas.openxmlformats.org/markup-compatibility/2006" xmlns:o="urn:schemas-microsoft-com:office:office" xmlns:r="http://schemas.openxmlformats.org/officeDocument/2006/relationships" xmlns:m="http://schemas.openxmlformats.org/officeDocument/2006/math" xmlns:v="urn:schemas-microsoft-com:vml" xmlns:wp14="http://schemas.microsoft.com/office/word/2010/wordprocessingDrawing" xmlns:wp="http://schemas.openxmlformats.org/drawingml/2006/wordprocessingDrawing" xmlns:w10="urn:schemas-microsoft-com:office:word" xmlns:w="http://schemas.openxmlformats.org/wordprocessingml/2006/main" xmlns:w14="http://schemas.microsoft.com/office/word/2010/wordml" xmlns:w15="http://schemas.microsoft.com/office/word/2012/wordml" xmlns:wpg="http://schemas.microsoft.com/office/word/2010/wordprocessingGroup" xmlns:wpi="http://schemas.microsoft.com/office/word/2010/wordprocessingInk" xmlns:wne="http://schemas.microsoft.com/office/word/2006/wordml" xmlns:wps="http://schemas.microsoft.com/office/word/2010/wordprocessingShape" xmlns:cx="http://schemas.microsoft.com/office/drawing/2014/chartex" xmlns:cx1="http://schemas.microsoft.com/office/drawing/2015/9/8/chartex" xmlns:cx2="http://schemas.microsoft.com/office/drawing/2015/10/21/chartex" xmlns:cx3="http://schemas.microsoft.com/office/drawing/2016/5/9/chartex" xmlns:cx4="http://schemas.microsoft.com/office/drawing/2016/5/10/chartex" xmlns:cx5="http://schemas.microsoft.com/office/drawing/2016/5/11/chartex" xmlns:cx6="http://schemas.microsoft.com/office/drawing/2016/5/12/chartex" xmlns:cx7="http://schemas.microsoft.com/office/drawing/2016/5/13/chartex" xmlns:cx8="http://schemas.microsoft.com/office/drawing/2016/5/14/chartex" xmlns:w16cid="http://schemas.microsoft.com/office/word/2016/wordml/cid" xmlns:w16se="http://schemas.microsoft.com/office/word/2015/wordml/symex">
+  <w:p/>
+</w:hdr>
+</file>
+
+<file path=word/header2.xml><?xml version="1.0" encoding="utf-8"?>
+<w:hdr xmlns:wpc="http://schemas.microsoft.com/office/word/2010/wordprocessingCanvas" xmlns:mc="http://schemas.openxmlformats.org/markup-compatibility/2006" xmlns:o="urn:schemas-microsoft-com:office:office" xmlns:r="http://schemas.openxmlformats.org/officeDocument/2006/relationships" xmlns:m="http://schemas.openxmlformats.org/officeDocument/2006/math" xmlns:v="urn:schemas-microsoft-com:vml" xmlns:wp14="http://schemas.microsoft.com/office/word/2010/wordprocessingDrawing" xmlns:wp="http://schemas.openxmlformats.org/drawingml/2006/wordprocessingDrawing" xmlns:w10="urn:schemas-microsoft-com:office:word" xmlns:w="http://schemas.openxmlformats.org/wordprocessingml/2006/main" xmlns:w14="http://schemas.microsoft.com/office/word/2010/wordml" xmlns:w15="http://schemas.microsoft.com/office/word/2012/wordml" xmlns:wpg="http://schemas.microsoft.com/office/word/2010/wordprocessingGroup" xmlns:wpi="http://schemas.microsoft.com/office/word/2010/wordprocessingInk" xmlns:wne="http://schemas.microsoft.com/office/word/2006/wordml" xmlns:wps="http://schemas.microsoft.com/office/word/2010/wordprocessingShape" xmlns:cx="http://schemas.microsoft.com/office/drawing/2014/chartex" xmlns:cx1="http://schemas.microsoft.com/office/drawing/2015/9/8/chartex" xmlns:cx2="http://schemas.microsoft.com/office/drawing/2015/10/21/chartex" xmlns:cx3="http://schemas.microsoft.com/office/drawing/2016/5/9/chartex" xmlns:cx4="http://schemas.microsoft.com/office/drawing/2016/5/10/chartex" xmlns:cx5="http://schemas.microsoft.com/office/drawing/2016/5/11/chartex" xmlns:cx6="http://schemas.microsoft.com/office/drawing/2016/5/12/chartex" xmlns:cx7="http://schemas.microsoft.com/office/drawing/2016/5/13/chartex" xmlns:cx8="http://schemas.microsoft.com/office/drawing/2016/5/14/chartex" xmlns:w16cid="http://schemas.microsoft.com/office/word/2016/wordml/cid" xmlns:w16se="http://schemas.microsoft.com/office/word/2015/wordml/symex">
+  <w:p/>
+</w:hdr>
+</file>
+
+<file path=word/header3.xml><?xml version="1.0" encoding="utf-8"?>
+<w:hdr xmlns:wpc="http://schemas.microsoft.com/office/word/2010/wordprocessingCanvas" xmlns:mc="http://schemas.openxmlformats.org/markup-compatibility/2006" xmlns:o="urn:schemas-microsoft-com:office:office" xmlns:r="http://schemas.openxmlformats.org/officeDocument/2006/relationships" xmlns:m="http://schemas.openxmlformats.org/officeDocument/2006/math" xmlns:v="urn:schemas-microsoft-com:vml" xmlns:wp14="http://schemas.microsoft.com/office/word/2010/wordprocessingDrawing" xmlns:wp="http://schemas.openxmlformats.org/drawingml/2006/wordprocessingDrawing" xmlns:w10="urn:schemas-microsoft-com:office:word" xmlns:w="http://schemas.openxmlformats.org/wordprocessingml/2006/main" xmlns:w14="http://schemas.microsoft.com/office/word/2010/wordml" xmlns:w15="http://schemas.microsoft.com/office/word/2012/wordml" xmlns:wpg="http://schemas.microsoft.com/office/word/2010/wordprocessingGroup" xmlns:wpi="http://schemas.microsoft.com/office/word/2010/wordprocessingInk" xmlns:wne="http://schemas.microsoft.com/office/word/2006/wordml" xmlns:wps="http://schemas.microsoft.com/office/word/2010/wordprocessingShape" xmlns:cx="http://schemas.microsoft.com/office/drawing/2014/chartex" xmlns:cx1="http://schemas.microsoft.com/office/drawing/2015/9/8/chartex" xmlns:cx2="http://schemas.microsoft.com/office/drawing/2015/10/21/chartex" xmlns:cx3="http://schemas.microsoft.com/office/drawing/2016/5/9/chartex" xmlns:cx4="http://schemas.microsoft.com/office/drawing/2016/5/10/chartex" xmlns:cx5="http://schemas.microsoft.com/office/drawing/2016/5/11/chartex" xmlns:cx6="http://schemas.microsoft.com/office/drawing/2016/5/12/chartex" xmlns:cx7="http://schemas.microsoft.com/office/drawing/2016/5/13/chartex" xmlns:cx8="http://schemas.microsoft.com/office/drawing/2016/5/14/chartex" xmlns:w16cid="http://schemas.microsoft.com/office/word/2016/wordml/cid" xmlns:w16se="http://schemas.microsoft.com/office/word/2015/wordml/symex">
+  <w:p>
+    <w:pPr>
+      <w:pBdr>
+        <w:bottom w:val="single" w:color="CFC9DE" w:sz="4" w:space="4"/>
+      </w:pBdr>
+      <w:tabs>
+        <w:tab w:val="right" w:pos="7711"/>
+      </w:tabs>
+    </w:pPr>
+    <w:r>
+      <w:rPr>
+        <w:rFonts w:ascii="Calibri" w:cs="Calibri" w:eastAsia="Calibri" w:hAnsi="Calibri"/>
+        <w:i/>
+        <w:iCs/>
+        <w:color w:val="6B6680"/>
+        <w:sz w:val="16"/>
+        <w:szCs w:val="16"/>
+      </w:rPr>
+      <w:t xml:space="preserve">Translation Handbook</w:t>
+    </w:r>
+    <w:r>
+      <w:rPr>
+        <w:rFonts w:ascii="Calibri" w:cs="Calibri" w:eastAsia="Calibri" w:hAnsi="Calibri"/>
+        <w:sz w:val="16"/>
+        <w:szCs w:val="16"/>
+      </w:rPr>
+      <w:tab/>
+    </w:r>
+    <w:fldSimple w:instr="STYLEREF &quot;Heading 1&quot;"/>
+  </w:p>
+</w:hdr>
+</file>
+
+<file path=word/header4.xml><?xml version="1.0" encoding="utf-8"?>
+<w:hdr xmlns:wpc="http://schemas.microsoft.com/office/word/2010/wordprocessingCanvas" xmlns:mc="http://schemas.openxmlformats.org/markup-compatibility/2006" xmlns:o="urn:schemas-microsoft-com:office:office" xmlns:r="http://schemas.openxmlformats.org/officeDocument/2006/relationships" xmlns:m="http://schemas.openxmlformats.org/officeDocument/2006/math" xmlns:v="urn:schemas-microsoft-com:vml" xmlns:wp14="http://schemas.microsoft.com/office/word/2010/wordprocessingDrawing" xmlns:wp="http://schemas.openxmlformats.org/drawingml/2006/wordprocessingDrawing" xmlns:w10="urn:schemas-microsoft-com:office:word" xmlns:w="http://schemas.openxmlformats.org/wordprocessingml/2006/main" xmlns:w14="http://schemas.microsoft.com/office/word/2010/wordml" xmlns:w15="http://schemas.microsoft.com/office/word/2012/wordml" xmlns:wpg="http://schemas.microsoft.com/office/word/2010/wordprocessingGroup" xmlns:wpi="http://schemas.microsoft.com/office/word/2010/wordprocessingInk" xmlns:wne="http://schemas.microsoft.com/office/word/2006/wordml" xmlns:wps="http://schemas.microsoft.com/office/word/2010/wordprocessingShape" xmlns:cx="http://schemas.microsoft.com/office/drawing/2014/chartex" xmlns:cx1="http://schemas.microsoft.com/office/drawing/2015/9/8/chartex" xmlns:cx2="http://schemas.microsoft.com/office/drawing/2015/10/21/chartex" xmlns:cx3="http://schemas.microsoft.com/office/drawing/2016/5/9/chartex" xmlns:cx4="http://schemas.microsoft.com/office/drawing/2016/5/10/chartex" xmlns:cx5="http://schemas.microsoft.com/office/drawing/2016/5/11/chartex" xmlns:cx6="http://schemas.microsoft.com/office/drawing/2016/5/12/chartex" xmlns:cx7="http://schemas.microsoft.com/office/drawing/2016/5/13/chartex" xmlns:cx8="http://schemas.microsoft.com/office/drawing/2016/5/14/chartex" xmlns:w16cid="http://schemas.microsoft.com/office/word/2016/wordml/cid" xmlns:w16se="http://schemas.microsoft.com/office/word/2015/wordml/symex">
+  <w:p/>
+</w:hdr>
 </file>
 
 <file path=word/numbering.xml><?xml version="1.0" encoding="utf-8"?>

</xml_diff>

<commit_message>
Move the cover titles to the top and use the Rusconi quote
Place the English and Arabic titles together at the top of the front
cover. Put Anna Rusconi's quote on the back cover and shorten the
description there. Remove the Guild Season mentions from the preface,
the copyright page and the back cover, since the handbook may also be
given as a gift.

Co-Authored-By: Claude Opus 5.5 <noreply@anthropic.com>
Claude-Session: https://claude.ai/code/session_01VkNWz9zCVkDAANuF8jpQYy
</commit_message>
<xml_diff>
--- a/Translation-Handbook.docx
+++ b/Translation-Handbook.docx
@@ -228,7 +228,7 @@
           <w:sz w:val="18"/>
           <w:szCs w:val="18"/>
         </w:rPr>
-        <w:t xml:space="preserve">First edition, 2026. Prepared by the Translation Team, Guild Professional Club, for use in the Guild Season workshops.</w:t>
+        <w:t xml:space="preserve">First edition, 2026. Prepared by the Translation Team, Guild Professional Club.</w:t>
       </w:r>
     </w:p>
     <w:p>
@@ -342,7 +342,7 @@
         <w:rPr>
           <w:rFonts w:ascii="Calibri" w:cs="Calibri" w:eastAsia="Calibri" w:hAnsi="Calibri"/>
         </w:rPr>
-        <w:t xml:space="preserve">This handbook was prepared by the Translation Team of the Guild Professional Club for students who are taking their first steps in translation between English and Arabic. It will be used in the team’s workshops during the Guild Season, and it is written so that it can also be read on its own.</w:t>
+        <w:t xml:space="preserve">This handbook was prepared by the Translation Team of the Guild Professional Club for students who are taking their first steps in translation between English and Arabic. It can be used in workshops or read on its own.</w:t>
       </w:r>
     </w:p>
     <w:p>

</xml_diff>